<commit_message>
Email results broken into wording, link and image components; automatic image scanning; real organizations admin page; scope document wording amended; cross-tenant SMTP and device claim fixes; Windows console crash fix; unit tests
</commit_message>
<xml_diff>
--- a/Scope Document final.docx
+++ b/Scope Document final.docx
@@ -5115,7 +5115,7 @@
           <w:szCs w:val="24"/>
           <w:highlight w:val="white"/>
         </w:rPr>
-        <w:t>annel coverage (email + browser + QR + behavioral + incident response) under one AI engine. Pre-credential-submission interception. XAI explains every detection decision via SHAP/LIME. Fully in-house - client data never leaves their own infrastructure. Ens</w:t>
+        <w:t>annel coverage (email + browser + QR + behavioral + incident response) under one AI engine. Pre-credential-submission interception. XAI explains every detection decision with an evidence-grounded explanation that names the exact signals found (impersonated brand, domain age, URL structure, QR payload, message wording) instead of a generic score. Fully in-house - client data never leaves their own infrastructure. Ens</w:t>
       </w:r>
       <w:r>
         <w:rPr>
@@ -6566,7 +6566,7 @@
                 <w:szCs w:val="24"/>
                 <w:highlight w:val="white"/>
               </w:rPr>
-              <w:t>AEGIS-ONE scans links AND monitors live user behavior. XAI (SHAP/LIME) explains every detection decision clearly. Also covers QR codes, fake login pages, and attachments - not just rewritten email lin</w:t>
+              <w:t>AEGIS-ONE scans links AND monitors live user behavior. Evidence-grounded XAI explains every detection decision clearly, quoting the exact signals found. Also covers QR codes, fake login pages, and attachments - not just rewritten email lin</w:t>
             </w:r>
             <w:r>
               <w:rPr>
@@ -8589,7 +8589,7 @@
           <w:szCs w:val="24"/>
           <w:highlight w:val="white"/>
         </w:rPr>
-        <w:t xml:space="preserve">Secure authentication (email/password + Google OAuth) with role-based access control (User, Employee </w:t>
+        <w:t xml:space="preserve">Secure authentication (in-house email/password accounts with signed, expiring access and refresh tokens; no third-party identity provider is used because the system is deployed fully in-house) with role-based access control (User, Employee </w:t>
       </w:r>
       <w:proofErr w:type="spellStart"/>
       <w:r>

</xml_diff>